<commit_message>
docs: remove report appendix
</commit_message>
<xml_diff>
--- a/rapport/Rapport_Intern_Webportal_HA.docx
+++ b/rapport/Rapport_Intern_Webportal_HA.docx
@@ -1532,19 +1532,6 @@
         <w:t>Den interne webportal er implementeret og dokumenteret som en fungerende HA-demo. Portaltrafik fordeles mellem to Linux-webnoder, VIP'en flytter ved proxyfejl, og testdata replikeres fra PostgreSQL-primæren til standbyen. De oprindelige funktionskrav er dermed nået inden for den valgte afgrænsning.</w:t>
       </w:r>
     </w:p>
-    <w:p>
-      <w:pPr>
-        <w:pStyle w:val="Heading2"/>
-      </w:pPr>
-      <w:r>
-        <w:t>Bilag: Dokumentationsgrundlag</w:t>
-      </w:r>
-    </w:p>
-    <w:p>
-      <w:r>
-        <w:t>Rapporten bygger på projektets versionsstyrede dokumentation: PROJEKTDEFINITION.md, AENDRINGSLOG.md, DRIFTSLOG.md og TESTPLAN.md samt den aktuelle implementering i GitHub-repositoryet linux-intern-webportal-ha-demo.</w:t>
-      </w:r>
-    </w:p>
     <w:sectPr>
       <w:headerReference w:type="default" r:id="rId9"/>
       <w:footerReference w:type="default" r:id="rId10"/>

</xml_diff>

<commit_message>
docs: update final HA project report
</commit_message>
<xml_diff>
--- a/rapport/Rapport_Intern_Webportal_HA.docx
+++ b/rapport/Rapport_Intern_Webportal_HA.docx
@@ -154,7 +154,7 @@
                 <w:rFonts w:ascii="Calibri" w:hAnsi="Calibri"/>
                 <w:sz w:val="21"/>
               </w:rPr>
-              <w:t>To Proxmox VE-værter med Debian LXC-containere</w:t>
+              <w:t>Tre Proxmox VE-værter med Debian LXC/VM-tjenester</w:t>
             </w:r>
           </w:p>
         </w:tc>
@@ -204,7 +204,7 @@
                 <w:rFonts w:ascii="Calibri" w:hAnsi="Calibri"/>
                 <w:sz w:val="21"/>
               </w:rPr>
-              <w:t>24. august 2026</w:t>
+              <w:t>25. august 2026</w:t>
             </w:r>
           </w:p>
         </w:tc>
@@ -254,7 +254,7 @@
                 <w:rFonts w:ascii="Calibri" w:hAnsi="Calibri"/>
                 <w:sz w:val="21"/>
               </w:rPr>
-              <w:t>Krav om web-HA og datareplikering er opfyldt</w:t>
+              <w:t>Web-HA, databasefailover, backup og restore er verificeret</w:t>
             </w:r>
           </w:p>
         </w:tc>
@@ -272,7 +272,7 @@
           <w:color w:val="7A5A00"/>
           <w:sz w:val="20"/>
         </w:rPr>
-        <w:t>Afgrænsning: Backup/PBS og tredje server indgår ikke i denne rapport.</w:t>
+        <w:t>Labafgrænsning: Lokal LVM erstatter ikke delt eller replikeret produktionsstorage.</w:t>
       </w:r>
     </w:p>
     <w:p>
@@ -290,12 +290,12 @@
     </w:p>
     <w:p>
       <w:r>
-        <w:t>Projektet har etableret en intern webportal på to fysiske Linux-baserede Proxmox VE-værter. Portalen er et mock-tidsregistreringssystem, der bruges til at demonstrere høj tilgængelighed, belastningsfordeling og datareplikering.</w:t>
+        <w:t>Projektet har etableret en intern webportal på tre fysiske Linux-baserede Proxmox VE-værter. Portalen er et mock-tidsregistreringssystem, der bruges til at demonstrere høj tilgængelighed, belastningsfordeling, datareplikering og databasefailover.</w:t>
       </w:r>
     </w:p>
     <w:p>
       <w:r>
-        <w:t>Løsningen opfylder de centrale krav: Trafik går via én virtuel IP-adresse, fordeles mellem to webservere og fortsætter ved fejl på en proxy eller webnode. Data gemmes i PostgreSQL på en primær database og replikeres løbende til en standby-database.</w:t>
+        <w:t>Løsningen opfylder de centrale krav: Trafik går via én virtuel IP-adresse, fordeles mellem to webservere og fortsætter ved fejl på en proxy eller webnode. PostgreSQL styres af Patroni med et tre-medlems etcd-kvorum, replikeres løbende og gendannes med pgBackRest/WAL til PBS01.</w:t>
       </w:r>
     </w:p>
     <w:p>
@@ -316,7 +316,7 @@
           <w:rFonts w:ascii="Calibri" w:hAnsi="Calibri"/>
           <w:sz w:val="22"/>
         </w:rPr>
-        <w:t>To Proxmox VE-værter er samlet i clusteret portal-ha.</w:t>
+        <w:t>Tre Proxmox VE-værter er samlet i clusteret portal-ha med quorum på to stemmer.</w:t>
       </w:r>
     </w:p>
     <w:p>
@@ -355,7 +355,7 @@
           <w:rFonts w:ascii="Calibri" w:hAnsi="Calibri"/>
           <w:sz w:val="22"/>
         </w:rPr>
-        <w:t>PostgreSQL 17 streaming-replikering er verificeret med testdata.</w:t>
+        <w:t>PostgreSQL 17, Patroni og etcd udfører automatisk databasefailover.</w:t>
       </w:r>
     </w:p>
     <w:p>
@@ -368,7 +368,20 @@
           <w:rFonts w:ascii="Calibri" w:hAnsi="Calibri"/>
           <w:sz w:val="22"/>
         </w:rPr>
-        <w:t>Test viser proxy-failover, web-failover, trafikfordeling og replikerede data.</w:t>
+        <w:t>PBS01 indeholder testet Proxmox- og pgBackRest/WAL-restore.</w:t>
+      </w:r>
+    </w:p>
+    <w:p>
+      <w:pPr>
+        <w:pStyle w:val="ListBullet"/>
+        <w:spacing w:after="80" w:line="280" w:lineRule="auto"/>
+      </w:pPr>
+      <w:r>
+        <w:rPr>
+          <w:rFonts w:ascii="Calibri" w:hAnsi="Calibri"/>
+          <w:sz w:val="22"/>
+        </w:rPr>
+        <w:t>Test viser proxy-, web-, database- og fysisk værtsfailover samt replikerede data.</w:t>
       </w:r>
     </w:p>
     <w:p>
@@ -394,7 +407,7 @@
     </w:p>
     <w:p>
       <w:r>
-        <w:t>Portalen er bevidst et mock-system. Den kan oprette og vise testregistreringer, men indeholder ikke login, løn, personadministration eller integrationer. En eventuel tredje server til Proxmox Backup Server eller QDevice er en senere ekstraopgave og er ikke en del af denne rapport eller vurderingen her.</w:t>
+        <w:t>Portalen er bevidst et mock-system. Den kan oprette og vise testregistreringer, men indeholder ikke login, løn, personadministration eller integrationer. En tredje PVE-vært, PBS01 og etcd indgår efter en dokumenteret scopeændring, fordi de giver sikkert quorum, backup og databasefailover i samme labmiljø.</w:t>
       </w:r>
     </w:p>
     <w:p>
@@ -668,7 +681,95 @@
                 <w:rFonts w:ascii="Calibri" w:hAnsi="Calibri"/>
                 <w:sz w:val="19"/>
               </w:rPr>
-              <w:t>PostgreSQL 17 med primær og fysisk streaming-standby.</w:t>
+              <w:t>PostgreSQL 17, Patroni og streaming-replika.</w:t>
+            </w:r>
+          </w:p>
+        </w:tc>
+      </w:tr>
+      <w:tr>
+        <w:tc>
+          <w:tcPr>
+            <w:tcW w:type="dxa" w:w="1500"/>
+          </w:tcPr>
+          <w:p>
+            <w:r>
+              <w:rPr>
+                <w:rFonts w:ascii="Calibri" w:hAnsi="Calibri"/>
+                <w:sz w:val="19"/>
+              </w:rPr>
+              <w:t>Konsensus</w:t>
+            </w:r>
+          </w:p>
+        </w:tc>
+        <w:tc>
+          <w:tcPr>
+            <w:tcW w:type="dxa" w:w="3300"/>
+          </w:tcPr>
+          <w:p>
+            <w:r>
+              <w:rPr>
+                <w:rFonts w:ascii="Calibri" w:hAnsi="Calibri"/>
+                <w:sz w:val="19"/>
+              </w:rPr>
+              <w:t>etcd01 / etcd02 / etcd03</w:t>
+            </w:r>
+          </w:p>
+        </w:tc>
+        <w:tc>
+          <w:tcPr>
+            <w:tcW w:type="dxa" w:w="4560"/>
+          </w:tcPr>
+          <w:p>
+            <w:r>
+              <w:rPr>
+                <w:rFonts w:ascii="Calibri" w:hAnsi="Calibri"/>
+                <w:sz w:val="19"/>
+              </w:rPr>
+              <w:t>Tre stemmer for sikker Patroni-promotion.</w:t>
+            </w:r>
+          </w:p>
+        </w:tc>
+      </w:tr>
+      <w:tr>
+        <w:tc>
+          <w:tcPr>
+            <w:tcW w:type="dxa" w:w="1500"/>
+          </w:tcPr>
+          <w:p>
+            <w:r>
+              <w:rPr>
+                <w:rFonts w:ascii="Calibri" w:hAnsi="Calibri"/>
+                <w:sz w:val="19"/>
+              </w:rPr>
+              <w:t>Backup</w:t>
+            </w:r>
+          </w:p>
+        </w:tc>
+        <w:tc>
+          <w:tcPr>
+            <w:tcW w:type="dxa" w:w="3300"/>
+          </w:tcPr>
+          <w:p>
+            <w:r>
+              <w:rPr>
+                <w:rFonts w:ascii="Calibri" w:hAnsi="Calibri"/>
+                <w:sz w:val="19"/>
+              </w:rPr>
+              <w:t>pbs01</w:t>
+            </w:r>
+          </w:p>
+        </w:tc>
+        <w:tc>
+          <w:tcPr>
+            <w:tcW w:type="dxa" w:w="4560"/>
+          </w:tcPr>
+          <w:p>
+            <w:r>
+              <w:rPr>
+                <w:rFonts w:ascii="Calibri" w:hAnsi="Calibri"/>
+                <w:sz w:val="19"/>
+              </w:rPr>
+              <w:t>PBS-datastore og pgBackRest/WAL-repository.</w:t>
             </w:r>
           </w:p>
         </w:tc>
@@ -698,7 +799,7 @@
                 <w:rFonts w:ascii="Calibri" w:hAnsi="Calibri"/>
                 <w:sz w:val="19"/>
               </w:rPr>
-              <w:t>pve01 / pve02</w:t>
+              <w:t>pve01 / pve02 / pve03</w:t>
             </w:r>
           </w:p>
         </w:tc>
@@ -712,7 +813,7 @@
                 <w:rFonts w:ascii="Calibri" w:hAnsi="Calibri"/>
                 <w:sz w:val="19"/>
               </w:rPr>
-              <w:t>To fysiske Proxmox VE-værter i clusteret portal-ha.</w:t>
+              <w:t>Tre fysiske Proxmox VE-værter i clusteret portal-ha.</w:t>
             </w:r>
           </w:p>
         </w:tc>
@@ -912,6 +1013,50 @@
                 <w:rFonts w:ascii="Calibri" w:hAnsi="Calibri"/>
                 <w:sz w:val="19"/>
               </w:rPr>
+              <w:t>pve03</w:t>
+            </w:r>
+          </w:p>
+        </w:tc>
+        <w:tc>
+          <w:tcPr>
+            <w:tcW w:type="dxa" w:w="2400"/>
+          </w:tcPr>
+          <w:p>
+            <w:r>
+              <w:rPr>
+                <w:rFonts w:ascii="Calibri" w:hAnsi="Calibri"/>
+                <w:sz w:val="19"/>
+              </w:rPr>
+              <w:t>192.168.1.35</w:t>
+            </w:r>
+          </w:p>
+        </w:tc>
+        <w:tc>
+          <w:tcPr>
+            <w:tcW w:type="dxa" w:w="4260"/>
+          </w:tcPr>
+          <w:p>
+            <w:r>
+              <w:rPr>
+                <w:rFonts w:ascii="Calibri" w:hAnsi="Calibri"/>
+                <w:sz w:val="19"/>
+              </w:rPr>
+              <w:t>Fysisk vært 3 / quorum / PBS</w:t>
+            </w:r>
+          </w:p>
+        </w:tc>
+      </w:tr>
+      <w:tr>
+        <w:tc>
+          <w:tcPr>
+            <w:tcW w:type="dxa" w:w="2700"/>
+          </w:tcPr>
+          <w:p>
+            <w:r>
+              <w:rPr>
+                <w:rFonts w:ascii="Calibri" w:hAnsi="Calibri"/>
+                <w:sz w:val="19"/>
+              </w:rPr>
               <w:t>proxy01 / proxy02</w:t>
             </w:r>
           </w:p>
@@ -1033,6 +1178,94 @@
           </w:p>
         </w:tc>
       </w:tr>
+      <w:tr>
+        <w:tc>
+          <w:tcPr>
+            <w:tcW w:type="dxa" w:w="2700"/>
+          </w:tcPr>
+          <w:p>
+            <w:r>
+              <w:rPr>
+                <w:rFonts w:ascii="Calibri" w:hAnsi="Calibri"/>
+                <w:sz w:val="19"/>
+              </w:rPr>
+              <w:t>pbs01</w:t>
+            </w:r>
+          </w:p>
+        </w:tc>
+        <w:tc>
+          <w:tcPr>
+            <w:tcW w:type="dxa" w:w="2400"/>
+          </w:tcPr>
+          <w:p>
+            <w:r>
+              <w:rPr>
+                <w:rFonts w:ascii="Calibri" w:hAnsi="Calibri"/>
+                <w:sz w:val="19"/>
+              </w:rPr>
+              <w:t>.47</w:t>
+            </w:r>
+          </w:p>
+        </w:tc>
+        <w:tc>
+          <w:tcPr>
+            <w:tcW w:type="dxa" w:w="4260"/>
+          </w:tcPr>
+          <w:p>
+            <w:r>
+              <w:rPr>
+                <w:rFonts w:ascii="Calibri" w:hAnsi="Calibri"/>
+                <w:sz w:val="19"/>
+              </w:rPr>
+              <w:t>PVE03</w:t>
+            </w:r>
+          </w:p>
+        </w:tc>
+      </w:tr>
+      <w:tr>
+        <w:tc>
+          <w:tcPr>
+            <w:tcW w:type="dxa" w:w="2700"/>
+          </w:tcPr>
+          <w:p>
+            <w:r>
+              <w:rPr>
+                <w:rFonts w:ascii="Calibri" w:hAnsi="Calibri"/>
+                <w:sz w:val="19"/>
+              </w:rPr>
+              <w:t>etcd01 / 02 / 03</w:t>
+            </w:r>
+          </w:p>
+        </w:tc>
+        <w:tc>
+          <w:tcPr>
+            <w:tcW w:type="dxa" w:w="2400"/>
+          </w:tcPr>
+          <w:p>
+            <w:r>
+              <w:rPr>
+                <w:rFonts w:ascii="Calibri" w:hAnsi="Calibri"/>
+                <w:sz w:val="19"/>
+              </w:rPr>
+              <w:t>.48 / .49 / .50</w:t>
+            </w:r>
+          </w:p>
+        </w:tc>
+        <w:tc>
+          <w:tcPr>
+            <w:tcW w:type="dxa" w:w="4260"/>
+          </w:tcPr>
+          <w:p>
+            <w:r>
+              <w:rPr>
+                <w:rFonts w:ascii="Calibri" w:hAnsi="Calibri"/>
+                <w:sz w:val="19"/>
+              </w:rPr>
+              <w:t>PVE01 / PVE02 / PVE03</w:t>
+            </w:r>
+          </w:p>
+        </w:tc>
+      </w:tr>
     </w:tbl>
     <w:p>
       <w:pPr>
@@ -1078,7 +1311,7 @@
     </w:p>
     <w:p>
       <w:r>
-        <w:t>db01 er PostgreSQL-primær, og db02 er fysisk standby. Standbyen modtager WAL-data løbende fra primæren. Portalens endpoint /replication viser antallet af streamende standbyer; ved test rapporterede begge webnoder værdien 1.</w:t>
+        <w:t>Patroni vælger én PostgreSQL-leder og holder den anden node som fysisk streaming-replika. Tre etcd-noder er konsensuslaget, og HAProxy sender kun databaseforbindelser til Patronis aktuelle /primary-node. Portalens endpoint /replication viser antallet af streamende standbyer.</w:t>
       </w:r>
     </w:p>
     <w:p>
@@ -1445,6 +1678,138 @@
           </w:p>
         </w:tc>
       </w:tr>
+      <w:tr>
+        <w:tc>
+          <w:tcPr>
+            <w:tcW w:type="dxa" w:w="2100"/>
+          </w:tcPr>
+          <w:p>
+            <w:r>
+              <w:rPr>
+                <w:rFonts w:ascii="Calibri" w:hAnsi="Calibri"/>
+                <w:sz w:val="19"/>
+              </w:rPr>
+              <w:t>Automatisk databasefailover</w:t>
+            </w:r>
+          </w:p>
+        </w:tc>
+        <w:tc>
+          <w:tcPr>
+            <w:tcW w:type="dxa" w:w="5600"/>
+          </w:tcPr>
+          <w:p>
+            <w:r>
+              <w:rPr>
+                <w:rFonts w:ascii="Calibri" w:hAnsi="Calibri"/>
+                <w:sz w:val="19"/>
+              </w:rPr>
+              <w:t>Stop af db01 gav automatisk promotion af db02; db01 kom tilbage som replika med 0 MB lag.</w:t>
+            </w:r>
+          </w:p>
+        </w:tc>
+        <w:tc>
+          <w:tcPr>
+            <w:tcW w:type="dxa" w:w="1660"/>
+          </w:tcPr>
+          <w:p>
+            <w:r>
+              <w:rPr>
+                <w:rFonts w:ascii="Calibri" w:hAnsi="Calibri"/>
+                <w:sz w:val="19"/>
+              </w:rPr>
+              <w:t>Opfyldt</w:t>
+            </w:r>
+          </w:p>
+        </w:tc>
+      </w:tr>
+      <w:tr>
+        <w:tc>
+          <w:tcPr>
+            <w:tcW w:type="dxa" w:w="2100"/>
+          </w:tcPr>
+          <w:p>
+            <w:r>
+              <w:rPr>
+                <w:rFonts w:ascii="Calibri" w:hAnsi="Calibri"/>
+                <w:sz w:val="19"/>
+              </w:rPr>
+              <w:t>Fysisk værtsfailover</w:t>
+            </w:r>
+          </w:p>
+        </w:tc>
+        <w:tc>
+          <w:tcPr>
+            <w:tcW w:type="dxa" w:w="5600"/>
+          </w:tcPr>
+          <w:p>
+            <w:r>
+              <w:rPr>
+                <w:rFonts w:ascii="Calibri" w:hAnsi="Calibri"/>
+                <w:sz w:val="19"/>
+              </w:rPr>
+              <w:t>Stop af pve01 beholdt quorum på pve02/pve03; VIP, portal og db02 fortsatte.</w:t>
+            </w:r>
+          </w:p>
+        </w:tc>
+        <w:tc>
+          <w:tcPr>
+            <w:tcW w:type="dxa" w:w="1660"/>
+          </w:tcPr>
+          <w:p>
+            <w:r>
+              <w:rPr>
+                <w:rFonts w:ascii="Calibri" w:hAnsi="Calibri"/>
+                <w:sz w:val="19"/>
+              </w:rPr>
+              <w:t>Opfyldt</w:t>
+            </w:r>
+          </w:p>
+        </w:tc>
+      </w:tr>
+      <w:tr>
+        <w:tc>
+          <w:tcPr>
+            <w:tcW w:type="dxa" w:w="2100"/>
+          </w:tcPr>
+          <w:p>
+            <w:r>
+              <w:rPr>
+                <w:rFonts w:ascii="Calibri" w:hAnsi="Calibri"/>
+                <w:sz w:val="19"/>
+              </w:rPr>
+              <w:t>Backup og restore</w:t>
+            </w:r>
+          </w:p>
+        </w:tc>
+        <w:tc>
+          <w:tcPr>
+            <w:tcW w:type="dxa" w:w="5600"/>
+          </w:tcPr>
+          <w:p>
+            <w:r>
+              <w:rPr>
+                <w:rFonts w:ascii="Calibri" w:hAnsi="Calibri"/>
+                <w:sz w:val="19"/>
+              </w:rPr>
+              <w:t>PBS-restore samt isoleret pgBackRest/WAL-restore returnerede kendt portaldata.</w:t>
+            </w:r>
+          </w:p>
+        </w:tc>
+        <w:tc>
+          <w:tcPr>
+            <w:tcW w:type="dxa" w:w="1660"/>
+          </w:tcPr>
+          <w:p>
+            <w:r>
+              <w:rPr>
+                <w:rFonts w:ascii="Calibri" w:hAnsi="Calibri"/>
+                <w:sz w:val="19"/>
+              </w:rPr>
+              <w:t>Opfyldt</w:t>
+            </w:r>
+          </w:p>
+        </w:tc>
+      </w:tr>
     </w:tbl>
     <w:p>
       <w:pPr>
@@ -1490,7 +1855,7 @@
           <w:rFonts w:ascii="Calibri" w:hAnsi="Calibri"/>
           <w:sz w:val="22"/>
         </w:rPr>
-        <w:t>Automatisk databasefailover er ikke aktiveret. Det kræver et sikkert konsensus- eller witness-design for at undgå split brain.</w:t>
+        <w:t>Etcd-trafik er ukrypteret HTTP i det afgrænsede lab-LAN; produktion kræver TLS og firewall-regler.</w:t>
       </w:r>
     </w:p>
     <w:p>
@@ -1503,7 +1868,7 @@
           <w:rFonts w:ascii="Calibri" w:hAnsi="Calibri"/>
           <w:sz w:val="22"/>
         </w:rPr>
-        <w:t>Automatisk overtagelse efter tab af en hel PVE-vært er ikke testet. Et to-noders cluster bør have en tredje QDevice-stemme, før den test udføres.</w:t>
+        <w:t>Services på en stoppet PVE-vært flyttes ikke automatisk, fordi LXC-diske ligger på lokal LVM. Redundante modparter fortsætter dog på den anden vært.</w:t>
       </w:r>
     </w:p>
     <w:p>
@@ -1516,7 +1881,7 @@
           <w:rFonts w:ascii="Calibri" w:hAnsi="Calibri"/>
           <w:sz w:val="22"/>
         </w:rPr>
-        <w:t>Backup, PBS og restore-test er uden for scope i denne rapport.</w:t>
+        <w:t>PBS01 ligger på samme fysiske lab som clusterets tredje vært og er ikke en off-site-backup.</w:t>
       </w:r>
     </w:p>
     <w:p>
@@ -1529,7 +1894,7 @@
     </w:p>
     <w:p>
       <w:r>
-        <w:t>Den interne webportal er implementeret og dokumenteret som en fungerende HA-demo. Portaltrafik fordeles mellem to Linux-webnoder, VIP'en flytter ved proxyfejl, og testdata replikeres fra PostgreSQL-primæren til standbyen. De oprindelige funktionskrav er dermed nået inden for den valgte afgrænsning.</w:t>
+        <w:t>Den interne webportal er implementeret og dokumenteret som en fungerende HA-demo. Portaltrafik fordeles mellem to Linux-webnoder, VIP'en flytter ved proxyfejl, og testdata replikeres og kan automatisk fortsætte på ny databaseleder. Den testede backup- og restorevej supplerer tilgængeligheden med gendannelse. De oprindelige funktionskrav og de dokumenterede HA-udvidelser er dermed nået inden for labafgrænsningen.</w:t>
       </w:r>
     </w:p>
     <w:sectPr>

</xml_diff>

<commit_message>
docs: finalize report and create handover material
</commit_message>
<xml_diff>
--- a/rapport/Rapport_Intern_Webportal_HA.docx
+++ b/rapport/Rapport_Intern_Webportal_HA.docx
@@ -204,7 +204,7 @@
                 <w:rFonts w:ascii="Calibri" w:hAnsi="Calibri"/>
                 <w:sz w:val="21"/>
               </w:rPr>
-              <w:t>25. august 2026</w:t>
+              <w:t>27. august 2026</w:t>
             </w:r>
           </w:p>
         </w:tc>
@@ -254,7 +254,7 @@
                 <w:rFonts w:ascii="Calibri" w:hAnsi="Calibri"/>
                 <w:sz w:val="21"/>
               </w:rPr>
-              <w:t>Web-HA, databasefailover, backup og restore er verificeret</w:t>
+              <w:t>Afsluttet lab: HA, failover, backup/restore og rullende vedligehold er verificeret</w:t>
             </w:r>
           </w:p>
         </w:tc>
@@ -1897,6 +1897,79 @@
         <w:t>Den interne webportal er implementeret og dokumenteret som en fungerende HA-demo. Portaltrafik fordeles mellem to Linux-webnoder, VIP'en flytter ved proxyfejl, og testdata replikeres og kan automatisk fortsætte på ny databaseleder. Den testede backup- og restorevej supplerer tilgængeligheden med gendannelse. De oprindelige funktionskrav og de dokumenterede HA-udvidelser er dermed nået inden for labafgrænsningen.</w:t>
       </w:r>
     </w:p>
+    <w:p>
+      <w:pPr>
+        <w:pStyle w:val="Heading1"/>
+      </w:pPr>
+      <w:r>
+        <w:t>8. Afsluttende driftsstatus</w:t>
+      </w:r>
+    </w:p>
+    <w:p>
+      <w:r>
+        <w:t>Efter de oprindelige failover- og restoretests blev hele miljøet gennemgået i en rullende vedligeholdelsesrunde. Etcd, proxyer, webnoder, databasepar, PBS01 og alle tre Proxmox-værter blev opdateret én redundant partner ad gangen. Undervejs blev Patroni flyttet kontrolleret til db01, og efter slutkontrollen var portal, etcd, database-replikering og Proxmox-quorum grønne. Alle værter, containere og PBS01 havde derefter nul ventende pakkeopdateringer.</w:t>
+      </w:r>
+    </w:p>
+    <w:p>
+      <w:pPr>
+        <w:pStyle w:val="Heading2"/>
+      </w:pPr>
+      <w:r>
+        <w:t>Ansvarlig opdateringsmodel</w:t>
+      </w:r>
+    </w:p>
+    <w:p>
+      <w:pPr>
+        <w:pStyle w:val="ListBullet"/>
+        <w:spacing w:after="80" w:line="280" w:lineRule="auto"/>
+      </w:pPr>
+      <w:r>
+        <w:rPr>
+          <w:rFonts w:ascii="Calibri" w:hAnsi="Calibri"/>
+          <w:sz w:val="22"/>
+        </w:rPr>
+        <w:t>Alle systemer henter dagligt pakkelister og downloader ventende opdateringer; ugentlig oprydning reducerer diskforbrug.</w:t>
+      </w:r>
+    </w:p>
+    <w:p>
+      <w:pPr>
+        <w:pStyle w:val="ListBullet"/>
+        <w:spacing w:after="80" w:line="280" w:lineRule="auto"/>
+      </w:pPr>
+      <w:r>
+        <w:rPr>
+          <w:rFonts w:ascii="Calibri" w:hAnsi="Calibri"/>
+          <w:sz w:val="22"/>
+        </w:rPr>
+        <w:t>Automatisk installation er bevidst fravalgt, fordi to redundante noder ellers kan opdatere eller genstarte samtidigt uden health-gate.</w:t>
+      </w:r>
+    </w:p>
+    <w:p>
+      <w:pPr>
+        <w:pStyle w:val="ListBullet"/>
+        <w:spacing w:after="80" w:line="280" w:lineRule="auto"/>
+      </w:pPr>
+      <w:r>
+        <w:rPr>
+          <w:rFonts w:ascii="Calibri" w:hAnsi="Calibri"/>
+          <w:sz w:val="22"/>
+        </w:rPr>
+        <w:t>Installationer sker i et aftalt vindue efter grøn PBS- og pgBackRest-backup, rask portal, Patroni-replika og cluster-quorum.</w:t>
+      </w:r>
+    </w:p>
+    <w:p>
+      <w:pPr>
+        <w:pStyle w:val="Heading2"/>
+      </w:pPr>
+      <w:r>
+        <w:t>Afsluttende vurdering</w:t>
+      </w:r>
+    </w:p>
+    <w:p>
+      <w:r>
+        <w:t>Projektet kan betragtes som færdigt som en dokumenteret HA-labdemonstration. Det er ikke en produktionsløsning: især delt/replikeret storage, TLS på etcd, netværksadskillelse og en off-site backupkopi ville være næste skridt ved reel drift. Begrænsningerne er kendte, begrundede og dokumenterede, og de ændrer ikke på, at opgavens krav og de valgte HA-udvidelser er testet og opfyldt i labmiljøet.</w:t>
+      </w:r>
+    </w:p>
     <w:sectPr>
       <w:headerReference w:type="default" r:id="rId9"/>
       <w:footerReference w:type="default" r:id="rId10"/>

</xml_diff>